<commit_message>
Revise interim report: drop soil map application, plan missing/outlier correction; add summary version
Co-Authored-By: Claude Opus 5.5 <noreply@anthropic.com>
Claude-Session: https://claude.ai/code/session_012fkmByY2zWmS7kA9iG8UhM
</commit_message>
<xml_diff>
--- a/K_토양침식성인자/중간보고서_토양침식성인자.docx
+++ b/K_토양침식성인자/중간보고서_토양침식성인자.docx
@@ -3701,34 +3701,6 @@
                 <w:sz w:val="19"/>
                 <w:szCs w:val="19"/>
               </w:rPr>
-              <w:t xml:space="preserve">정밀토양도 SHP 확보 제한: </w:t>
-            </w:r>
-            <w:r>
-              <w:rPr>
-                <w:rFonts w:ascii="맑은 고딕" w:cs="맑은 고딕" w:eastAsia="맑은 고딕" w:hAnsi="맑은 고딕"/>
-                <w:sz w:val="19"/>
-                <w:szCs w:val="19"/>
-              </w:rPr>
-              <w:t xml:space="preserve">필지 단위 토양통 지도(1:25,000)는 흙토람 "토양도 신청"(비영리 목적, 보안서약서·지도교수 직인, 공문)이 필요해 바로 받을 수 없음 → 공개 통계(면·리 단위 토양부호 면적)로 지역별 K를 산정하고, 신청은 병행 추진</w:t>
-            </w:r>
-          </w:p>
-          <w:p>
-            <w:pPr>
-              <w:pStyle w:val="ListParagraph"/>
-              <w:numPr>
-                <w:ilvl w:val="0"/>
-                <w:numId w:val="2"/>
-              </w:numPr>
-              <w:spacing w:after="30" w:before="20" w:line="276"/>
-            </w:pPr>
-            <w:r>
-              <w:rPr>
-                <w:rFonts w:ascii="맑은 고딕" w:cs="맑은 고딕" w:eastAsia="맑은 고딕" w:hAnsi="맑은 고딕"/>
-                <w:b/>
-                <w:bCs/>
-                <w:sz w:val="19"/>
-                <w:szCs w:val="19"/>
-              </w:rPr>
               <w:t xml:space="preserve">전지구 자료의 변별력 부족: </w:t>
             </w:r>
             <w:r>
@@ -3757,7 +3729,7 @@
                 <w:sz w:val="19"/>
                 <w:szCs w:val="19"/>
               </w:rPr>
-              <w:t xml:space="preserve">토지이용 구분 불일치: </w:t>
+              <w:t xml:space="preserve">결측치: </w:t>
             </w:r>
             <w:r>
               <w:rPr>
@@ -3765,7 +3737,7 @@
                 <w:sz w:val="19"/>
                 <w:szCs w:val="19"/>
               </w:rPr>
-              <w:t xml:space="preserve">흙토람 면적표의 "밭"은 토양 조건상 추천 구분이라 실제 밭과 다름 → 팜맵 실제 밭 필지와 결합이 필요</w:t>
+              <w:t xml:space="preserve">고시 표2에 없는 토양통 5개(정동 1,872ha, 청룡 453ha, 매봉 125ha, 본량·우지 각 8ha, 합계 2,466ha)는 K가 비어 있음 (정선 여량면 9.1%, 강릉 왕산면 3.2%). SoilGrids 값이 없는 필지 0~1.7%는 최근접 필지 값으로 임시 보간. HWSD 표토 속성에 -3·-9(자료 없음) 코드가 섞여 있음</w:t>
             </w:r>
           </w:p>
           <w:p>
@@ -3785,7 +3757,7 @@
                 <w:sz w:val="19"/>
                 <w:szCs w:val="19"/>
               </w:rPr>
-              <w:t xml:space="preserve">고시 표2 미수록 토양통: </w:t>
+              <w:t xml:space="preserve">이상치 의심값: </w:t>
             </w:r>
             <w:r>
               <w:rPr>
@@ -3793,7 +3765,35 @@
                 <w:sz w:val="19"/>
                 <w:szCs w:val="19"/>
               </w:rPr>
-              <w:t xml:space="preserve">5개 토양통이 표에 없어 일부 지역 면적이 결측 (정선 여량면 9.1%, 강릉 왕산면 3.2%)</w:t>
+              <w:t xml:space="preserve">고시 표2의 IQR 상한(0.0628)을 넘는 토양통 존재(이현 0.0643). 대관령면 등에 넓게 분포하는 월정통(23,442ha)은 0.0112로 낮아 지역 평균을 크게 끌어내림. SoilGrids 필지 유기탄소가 실제 밭보다 높게 잡혔을 가능성</w:t>
+            </w:r>
+          </w:p>
+          <w:p>
+            <w:pPr>
+              <w:pStyle w:val="ListParagraph"/>
+              <w:numPr>
+                <w:ilvl w:val="0"/>
+                <w:numId w:val="2"/>
+              </w:numPr>
+              <w:spacing w:after="30" w:before="20" w:line="276"/>
+            </w:pPr>
+            <w:r>
+              <w:rPr>
+                <w:rFonts w:ascii="맑은 고딕" w:cs="맑은 고딕" w:eastAsia="맑은 고딕" w:hAnsi="맑은 고딕"/>
+                <w:b/>
+                <w:bCs/>
+                <w:sz w:val="19"/>
+                <w:szCs w:val="19"/>
+              </w:rPr>
+              <w:t xml:space="preserve">토지이용 구분 불일치: </w:t>
+            </w:r>
+            <w:r>
+              <w:rPr>
+                <w:rFonts w:ascii="맑은 고딕" w:cs="맑은 고딕" w:eastAsia="맑은 고딕" w:hAnsi="맑은 고딕"/>
+                <w:sz w:val="19"/>
+                <w:szCs w:val="19"/>
+              </w:rPr>
+              <w:t xml:space="preserve">흙토람 면적표의 "밭"은 토양 조건상 추천 구분이라 실제 밭과 다름 → 팜맵 실제 밭 필지와 결합이 필요</w:t>
             </w:r>
           </w:p>
           <w:p>
@@ -4394,23 +4394,23 @@
                       <w:sz w:val="15"/>
                       <w:szCs w:val="15"/>
                     </w:rPr>
-                    <w:t xml:space="preserve">흙토람 통계·고시 표2·SoilGrids 채택,</w:t>
-                  </w:r>
-                </w:p>
-                <w:p>
-                  <w:pPr>
-                    <w:spacing w:after="0" w:before="0"/>
-                    <w:jc w:val="left"/>
-                  </w:pPr>
-                  <w:r>
-                    <w:rPr>
-                      <w:rFonts w:ascii="맑은 고딕" w:cs="맑은 고딕" w:eastAsia="맑은 고딕" w:hAnsi="맑은 고딕"/>
-                      <w:b w:val="false"/>
-                      <w:bCs w:val="false"/>
-                      <w:sz w:val="15"/>
-                      <w:szCs w:val="15"/>
-                    </w:rPr>
-                    <w:t xml:space="preserve">정밀토양도는 신청 필요로 제외</w:t>
+                    <w:t xml:space="preserve">흙토람 통계·고시 표2·</w:t>
+                  </w:r>
+                </w:p>
+                <w:p>
+                  <w:pPr>
+                    <w:spacing w:after="0" w:before="0"/>
+                    <w:jc w:val="left"/>
+                  </w:pPr>
+                  <w:r>
+                    <w:rPr>
+                      <w:rFonts w:ascii="맑은 고딕" w:cs="맑은 고딕" w:eastAsia="맑은 고딕" w:hAnsi="맑은 고딕"/>
+                      <w:b w:val="false"/>
+                      <w:bCs w:val="false"/>
+                      <w:sz w:val="15"/>
+                      <w:szCs w:val="15"/>
+                    </w:rPr>
+                    <w:t xml:space="preserve">SoilGrids 자료 채택</w:t>
                   </w:r>
                 </w:p>
               </w:tc>
@@ -4461,7 +4461,7 @@
                       <w:sz w:val="15"/>
                       <w:szCs w:val="15"/>
                     </w:rPr>
-                    <w:t xml:space="preserve">신청 조건 확인</w:t>
+                    <w:t xml:space="preserve">자료 내용·이용 조건 확인</w:t>
                   </w:r>
                 </w:p>
               </w:tc>
@@ -5885,15 +5885,61 @@
                 <w:sz w:val="19"/>
                 <w:szCs w:val="19"/>
               </w:rPr>
-              <w:t xml:space="preserve">정밀토양도 신청·적용: </w:t>
+              <w:t xml:space="preserve">결측치 보정 (K 최종값 확정): </w:t>
             </w:r>
+          </w:p>
+          <w:p>
+            <w:pPr>
+              <w:pStyle w:val="ListParagraph"/>
+              <w:numPr>
+                <w:ilvl w:val="1"/>
+                <w:numId w:val="2"/>
+              </w:numPr>
+              <w:spacing w:after="30" w:before="20" w:line="276"/>
+            </w:pPr>
             <w:r>
               <w:rPr>
                 <w:rFonts w:ascii="맑은 고딕" w:cs="맑은 고딕" w:eastAsia="맑은 고딕" w:hAnsi="맑은 고딕"/>
                 <w:sz w:val="19"/>
                 <w:szCs w:val="19"/>
               </w:rPr>
-              <w:t xml:space="preserve">흙토람 토양도 신청(보안서약서·공문) → 승인 시 토양부호 폴리곤에 고시 K를 연결해 필지 단위 K 지도 작성, 팜맵 실제 밭 필지와 결합</w:t>
+              <w:t xml:space="preserve">고시 표2에 없는 토양통 5개: 이미 수집한 흙토람 토양통 설명서의 대표토양 분석치(모래·미사·점토·극세사·유기탄소)와 토양특성(구조·배수)으로 고시 Wischmeier 식 K를 계산해 채움. 설명서에 적힌 유사 토양통의 K와 비교해 타당성 확인 (정동통은 극세사 값이 없어 유사 토양통 값 활용 검토)</w:t>
+            </w:r>
+          </w:p>
+          <w:p>
+            <w:pPr>
+              <w:pStyle w:val="ListParagraph"/>
+              <w:numPr>
+                <w:ilvl w:val="1"/>
+                <w:numId w:val="2"/>
+              </w:numPr>
+              <w:spacing w:after="30" w:before="20" w:line="276"/>
+            </w:pPr>
+            <w:r>
+              <w:rPr>
+                <w:rFonts w:ascii="맑은 고딕" w:cs="맑은 고딕" w:eastAsia="맑은 고딕" w:hAnsi="맑은 고딕"/>
+                <w:sz w:val="19"/>
+                <w:szCs w:val="19"/>
+              </w:rPr>
+              <w:t xml:space="preserve">SoilGrids 결측 필지: 최근접 보간을 같은 토양통·인접 필지 평균 방식과 비교하고, 보간 여부 표시는 유지</w:t>
+            </w:r>
+          </w:p>
+          <w:p>
+            <w:pPr>
+              <w:pStyle w:val="ListParagraph"/>
+              <w:numPr>
+                <w:ilvl w:val="1"/>
+                <w:numId w:val="2"/>
+              </w:numPr>
+              <w:spacing w:after="30" w:before="20" w:line="276"/>
+            </w:pPr>
+            <w:r>
+              <w:rPr>
+                <w:rFonts w:ascii="맑은 고딕" w:cs="맑은 고딕" w:eastAsia="맑은 고딕" w:hAnsi="맑은 고딕"/>
+                <w:sz w:val="19"/>
+                <w:szCs w:val="19"/>
+              </w:rPr>
+              <w:t xml:space="preserve">HWSD -3·-9 코드는 자료 없음으로 처리해 가중평균에서 빼고 다시 계산</w:t>
             </w:r>
           </w:p>
           <w:p>
@@ -5913,15 +5959,61 @@
                 <w:sz w:val="19"/>
                 <w:szCs w:val="19"/>
               </w:rPr>
-              <w:t xml:space="preserve">K 검증: </w:t>
+              <w:t xml:space="preserve">이상치 보정: </w:t>
             </w:r>
+          </w:p>
+          <w:p>
+            <w:pPr>
+              <w:pStyle w:val="ListParagraph"/>
+              <w:numPr>
+                <w:ilvl w:val="1"/>
+                <w:numId w:val="2"/>
+              </w:numPr>
+              <w:spacing w:after="30" w:before="20" w:line="276"/>
+            </w:pPr>
             <w:r>
               <w:rPr>
                 <w:rFonts w:ascii="맑은 고딕" w:cs="맑은 고딕" w:eastAsia="맑은 고딕" w:hAnsi="맑은 고딕"/>
                 <w:sz w:val="19"/>
                 <w:szCs w:val="19"/>
               </w:rPr>
-              <w:t xml:space="preserve">이미 수집한 흙토람 토양특성 통계(표토토성·자갈·구조·배수)와 토양통 대표토양 분석치로 고시의 Wischmeier 식 K를 다시 계산해 표2 값과 비교, 자갈 많은 고랭지 밭의 자갈 보정 검토</w:t>
+              <w:t xml:space="preserve">고시 K: IQR 기준을 벗어나거나 토성과 맞지 않는 값(이현 0.0643, 월정 0.0112 등)을 고시 원문·토양통 설명서와 대조하고, 토성·유기탄소로 다시 계산한 K와 비교해 보정 여부 결정</w:t>
+            </w:r>
+          </w:p>
+          <w:p>
+            <w:pPr>
+              <w:pStyle w:val="ListParagraph"/>
+              <w:numPr>
+                <w:ilvl w:val="1"/>
+                <w:numId w:val="2"/>
+              </w:numPr>
+              <w:spacing w:after="30" w:before="20" w:line="276"/>
+            </w:pPr>
+            <w:r>
+              <w:rPr>
+                <w:rFonts w:ascii="맑은 고딕" w:cs="맑은 고딕" w:eastAsia="맑은 고딕" w:hAnsi="맑은 고딕"/>
+                <w:sz w:val="19"/>
+                <w:szCs w:val="19"/>
+              </w:rPr>
+              <w:t xml:space="preserve">SoilGrids 필지: 유기탄소·입경이 흙토람 대표토양 분석치 범위를 벗어나는 필지를 찾아 표시하고, 보정 전후 K를 함께 기록</w:t>
+            </w:r>
+          </w:p>
+          <w:p>
+            <w:pPr>
+              <w:pStyle w:val="ListParagraph"/>
+              <w:numPr>
+                <w:ilvl w:val="1"/>
+                <w:numId w:val="2"/>
+              </w:numPr>
+              <w:spacing w:after="30" w:before="20" w:line="276"/>
+            </w:pPr>
+            <w:r>
+              <w:rPr>
+                <w:rFonts w:ascii="맑은 고딕" w:cs="맑은 고딕" w:eastAsia="맑은 고딕" w:hAnsi="맑은 고딕"/>
+                <w:sz w:val="19"/>
+                <w:szCs w:val="19"/>
+              </w:rPr>
+              <w:t xml:space="preserve">면적표: 면적 0ha 행(948행 중 66행) 정리, 리 단위 합계와 면 단위 합계의 정합성 확인</w:t>
             </w:r>
           </w:p>
           <w:p>
@@ -5949,7 +6041,7 @@
                 <w:sz w:val="19"/>
                 <w:szCs w:val="19"/>
               </w:rPr>
-              <w:t xml:space="preserve">R·LS·C·P 인자와 같은 좌표계(EPSG:5179)·DEM 90m 격자로 맞춰 연간 토양유실량(A) 산정, 지역별 위험 순위 도출</w:t>
+              <w:t xml:space="preserve">보정된 K를 R·LS·C·P 인자와 같은 좌표계(EPSG:5179)·DEM 90m 격자에 맞춰 연간 토양유실량(A) 산정, 지역별 위험 순위 도출</w:t>
             </w:r>
           </w:p>
           <w:p>
@@ -5977,7 +6069,7 @@
                 <w:sz w:val="19"/>
                 <w:szCs w:val="19"/>
               </w:rPr>
-              <w:t xml:space="preserve">K 출처(고시 / SoilGrids)에 따라 A와 위험 순위가 얼마나 바뀌는지 비교</w:t>
+              <w:t xml:space="preserve">보정 전후, K 출처(고시 / SoilGrids)에 따라 A와 위험 순위가 얼마나 바뀌는지 비교</w:t>
             </w:r>
           </w:p>
           <w:p>
@@ -6255,7 +6347,7 @@
                       <w:sz w:val="16"/>
                       <w:szCs w:val="16"/>
                     </w:rPr>
-                    <w:t xml:space="preserve">정밀토양도 신청, 필지별 K 지도, K 검증·민감도 분석</w:t>
+                    <w:t xml:space="preserve">K 결측치·이상치 보정, K 최종값 확정, 민감도 분석</w:t>
                   </w:r>
                 </w:p>
               </w:tc>

</xml_diff>

<commit_message>
Limit interim report to the two submitted packages; K-part R&R only
Co-Authored-By: Claude Opus 5.5 <noreply@anthropic.com>
Claude-Session: https://claude.ai/code/session_012fkmByY2zWmS7kA9iG8UhM
</commit_message>
<xml_diff>
--- a/K_토양침식성인자/중간보고서_토양침식성인자.docx
+++ b/K_토양침식성인자/중간보고서_토양침식성인자.docx
@@ -3821,7 +3821,7 @@
                 <w:sz w:val="19"/>
                 <w:szCs w:val="19"/>
               </w:rPr>
-              <w:t xml:space="preserve">흙토람 통계가 리포트 뷰어로만 표시되고 서버 연결이 자주 끊김 → 사이트의 내보내기 기능을 그대로 호출해 원본 확보, 재시도 및 조회 기록 보관</w:t>
+              <w:t xml:space="preserve">흙토람 통계는 화면 보고서로만 제공되고 연결이 자주 끊김 → 보고서의 엑셀·PDF 내보내기로 원본을 확보하고 조회 조건 기록(_요청기록.json)을 보관</w:t>
             </w:r>
           </w:p>
           <w:p>
@@ -5903,7 +5903,7 @@
                 <w:sz w:val="19"/>
                 <w:szCs w:val="19"/>
               </w:rPr>
-              <w:t xml:space="preserve">고시 표2에 없는 토양통 5개: 이미 수집한 흙토람 토양통 설명서의 대표토양 분석치(모래·미사·점토·극세사·유기탄소)와 토양특성(구조·배수)으로 고시 Wischmeier 식 K를 계산해 채움. 설명서에 적힌 유사 토양통의 K와 비교해 타당성 확인 (정동통은 극세사 값이 없어 유사 토양통 값 활용 검토)</w:t>
+              <w:t xml:space="preserve">고시 표2에 없는 토양통 5개(정동·청룡·매봉·본량·우지): 흙토람 토양통 검색의 대표토양 분석치(모래·미사·점토·극세사·유기물)와 구조·투수 정보를 추가로 확보해, 고시의 Wischmeier 식으로 K를 계산해 채움. 표토토성이 같은 토양통의 K와 비교해 타당성 확인</w:t>
             </w:r>
           </w:p>
           <w:p>
@@ -5977,7 +5977,7 @@
                 <w:sz w:val="19"/>
                 <w:szCs w:val="19"/>
               </w:rPr>
-              <w:t xml:space="preserve">고시 K: IQR 기준을 벗어나거나 토성과 맞지 않는 값(이현 0.0643, 월정 0.0112 등)을 고시 원문·토양통 설명서와 대조하고, 토성·유기탄소로 다시 계산한 K와 비교해 보정 여부 결정</w:t>
+              <w:t xml:space="preserve">고시 K: IQR 기준을 벗어나거나 토성과 맞지 않는 값(이현 0.0643, 월정 0.0112 등)을 고시 원문과 대조하고, 흙토람 토양통 목록의 표토토성과 비교해 보정 여부 결정</w:t>
             </w:r>
           </w:p>
           <w:p>
@@ -5995,7 +5995,7 @@
                 <w:sz w:val="19"/>
                 <w:szCs w:val="19"/>
               </w:rPr>
-              <w:t xml:space="preserve">SoilGrids 필지: 유기탄소·입경이 흙토람 대표토양 분석치 범위를 벗어나는 필지를 찾아 표시하고, 보정 전후 K를 함께 기록</w:t>
+              <w:t xml:space="preserve">SoilGrids 필지: 유기탄소·입경이 지역 분포에서 크게 벗어나는 필지를 찾아 표시하고, 보정 전후 K를 함께 기록</w:t>
             </w:r>
           </w:p>
           <w:p>
@@ -6041,7 +6041,7 @@
                 <w:sz w:val="19"/>
                 <w:szCs w:val="19"/>
               </w:rPr>
-              <w:t xml:space="preserve">보정된 K를 R·LS·C·P 인자와 같은 좌표계(EPSG:5179)·DEM 90m 격자에 맞춰 연간 토양유실량(A) 산정, 지역별 위험 순위 도출</w:t>
+              <w:t xml:space="preserve">보정된 K를 팀의 다른 인자와 같은 좌표계(EPSG:5179)·DEM 90m 격자에 맞춰 RUSLE(A = R·K·LS·C·P) 계산에 제공</w:t>
             </w:r>
           </w:p>
           <w:p>
@@ -6069,7 +6069,7 @@
                 <w:sz w:val="19"/>
                 <w:szCs w:val="19"/>
               </w:rPr>
-              <w:t xml:space="preserve">보정 전후, K 출처(고시 / SoilGrids)에 따라 A와 위험 순위가 얼마나 바뀌는지 비교</w:t>
+              <w:t xml:space="preserve">보정 전후, K 출처(고시 / SoilGrids)에 따라 지역별 K 순위가 얼마나 바뀌는지 비교</w:t>
             </w:r>
           </w:p>
           <w:p>
@@ -6112,7 +6112,7 @@
                 <w:sz w:val="19"/>
                 <w:szCs w:val="19"/>
               </w:rPr>
-              <w:t xml:space="preserve">R&amp;R</w:t>
+              <w:t xml:space="preserve">R&amp;R (토양침식성인자 파트)</w:t>
             </w:r>
           </w:p>
           <w:tbl>
@@ -6128,9 +6128,8 @@
               </w:tblBorders>
             </w:tblPr>
             <w:tblGrid>
-              <w:gridCol w:w="2000"/>
-              <w:gridCol w:w="1700"/>
-              <w:gridCol w:w="4400"/>
+              <w:gridCol w:w="2400"/>
+              <w:gridCol w:w="5700"/>
             </w:tblGrid>
             <w:tr>
               <w:trPr>
@@ -6138,7 +6137,7 @@
               </w:trPr>
               <w:tc>
                 <w:tcPr>
-                  <w:tcW w:type="dxa" w:w="2000"/>
+                  <w:tcW w:type="dxa" w:w="2400"/>
                   <w:tcBorders>
                     <w:top w:val="single" w:color="A6A6A6" w:sz="4"/>
                     <w:left w:val="single" w:color="A6A6A6" w:sz="4"/>
@@ -6168,13 +6167,13 @@
                       <w:sz w:val="16"/>
                       <w:szCs w:val="16"/>
                     </w:rPr>
-                    <w:t xml:space="preserve">역할</w:t>
-                  </w:r>
-                </w:p>
-              </w:tc>
-              <w:tc>
-                <w:tcPr>
-                  <w:tcW w:type="dxa" w:w="1700"/>
+                    <w:t xml:space="preserve">구분</w:t>
+                  </w:r>
+                </w:p>
+              </w:tc>
+              <w:tc>
+                <w:tcPr>
+                  <w:tcW w:type="dxa" w:w="5700"/>
                   <w:tcBorders>
                     <w:top w:val="single" w:color="A6A6A6" w:sz="4"/>
                     <w:left w:val="single" w:color="A6A6A6" w:sz="4"/>
@@ -6204,43 +6203,79 @@
                       <w:sz w:val="16"/>
                       <w:szCs w:val="16"/>
                     </w:rPr>
-                    <w:t xml:space="preserve">담당</w:t>
-                  </w:r>
-                </w:p>
-              </w:tc>
-              <w:tc>
-                <w:tcPr>
-                  <w:tcW w:type="dxa" w:w="4400"/>
-                  <w:tcBorders>
-                    <w:top w:val="single" w:color="A6A6A6" w:sz="4"/>
-                    <w:left w:val="single" w:color="A6A6A6" w:sz="4"/>
-                    <w:bottom w:val="single" w:color="A6A6A6" w:sz="4"/>
-                    <w:right w:val="single" w:color="A6A6A6" w:sz="4"/>
-                  </w:tcBorders>
-                  <w:shd w:fill="4F81BD" w:color="auto" w:val="clear"/>
-                  <w:tcMar>
-                    <w:top w:type="dxa" w:w="50"/>
-                    <w:left w:type="dxa" w:w="80"/>
-                    <w:bottom w:type="dxa" w:w="50"/>
-                    <w:right w:type="dxa" w:w="80"/>
-                  </w:tcMar>
-                  <w:vAlign w:val="center"/>
-                </w:tcPr>
-                <w:p>
-                  <w:pPr>
-                    <w:spacing w:after="0" w:before="0"/>
-                    <w:jc w:val="center"/>
-                  </w:pPr>
-                  <w:r>
-                    <w:rPr>
-                      <w:rFonts w:ascii="맑은 고딕" w:cs="맑은 고딕" w:eastAsia="맑은 고딕" w:hAnsi="맑은 고딕"/>
-                      <w:b/>
-                      <w:bCs/>
-                      <w:color w:val="FFFFFF"/>
+                    <w:t xml:space="preserve">주요 업무</w:t>
+                  </w:r>
+                </w:p>
+              </w:tc>
+            </w:tr>
+            <w:tr>
+              <w:tc>
+                <w:tcPr>
+                  <w:tcW w:type="dxa" w:w="2400"/>
+                  <w:tcBorders>
+                    <w:top w:val="single" w:color="A6A6A6" w:sz="4"/>
+                    <w:left w:val="single" w:color="A6A6A6" w:sz="4"/>
+                    <w:bottom w:val="single" w:color="A6A6A6" w:sz="4"/>
+                    <w:right w:val="single" w:color="A6A6A6" w:sz="4"/>
+                  </w:tcBorders>
+                  <w:shd w:fill="DCE6F1" w:color="auto" w:val="clear"/>
+                  <w:tcMar>
+                    <w:top w:type="dxa" w:w="50"/>
+                    <w:left w:type="dxa" w:w="80"/>
+                    <w:bottom w:type="dxa" w:w="50"/>
+                    <w:right w:type="dxa" w:w="80"/>
+                  </w:tcMar>
+                  <w:vAlign w:val="center"/>
+                </w:tcPr>
+                <w:p>
+                  <w:pPr>
+                    <w:spacing w:after="0" w:before="0"/>
+                    <w:jc w:val="left"/>
+                  </w:pPr>
+                  <w:r>
+                    <w:rPr>
+                      <w:rFonts w:ascii="맑은 고딕" w:cs="맑은 고딕" w:eastAsia="맑은 고딕" w:hAnsi="맑은 고딕"/>
+                      <w:b w:val="false"/>
+                      <w:bCs w:val="false"/>
                       <w:sz w:val="16"/>
                       <w:szCs w:val="16"/>
                     </w:rPr>
-                    <w:t xml:space="preserve">주요 업무</w:t>
+                    <w:t xml:space="preserve">결측치 보정</w:t>
+                  </w:r>
+                </w:p>
+              </w:tc>
+              <w:tc>
+                <w:tcPr>
+                  <w:tcW w:type="dxa" w:w="5700"/>
+                  <w:tcBorders>
+                    <w:top w:val="single" w:color="A6A6A6" w:sz="4"/>
+                    <w:left w:val="single" w:color="A6A6A6" w:sz="4"/>
+                    <w:bottom w:val="single" w:color="A6A6A6" w:sz="4"/>
+                    <w:right w:val="single" w:color="A6A6A6" w:sz="4"/>
+                  </w:tcBorders>
+                  <w:shd w:fill="DCE6F1" w:color="auto" w:val="clear"/>
+                  <w:tcMar>
+                    <w:top w:type="dxa" w:w="50"/>
+                    <w:left w:type="dxa" w:w="80"/>
+                    <w:bottom w:type="dxa" w:w="50"/>
+                    <w:right w:type="dxa" w:w="80"/>
+                  </w:tcMar>
+                  <w:vAlign w:val="center"/>
+                </w:tcPr>
+                <w:p>
+                  <w:pPr>
+                    <w:spacing w:after="0" w:before="0"/>
+                    <w:jc w:val="left"/>
+                  </w:pPr>
+                  <w:r>
+                    <w:rPr>
+                      <w:rFonts w:ascii="맑은 고딕" w:cs="맑은 고딕" w:eastAsia="맑은 고딕" w:hAnsi="맑은 고딕"/>
+                      <w:b w:val="false"/>
+                      <w:bCs w:val="false"/>
+                      <w:sz w:val="16"/>
+                      <w:szCs w:val="16"/>
+                    </w:rPr>
+                    <w:t xml:space="preserve">미수록 토양통 K 산정, 결측 필지 보간 방식 비교, HWSD 결측 코드 처리</w:t>
                   </w:r>
                 </w:p>
               </w:tc>
@@ -6248,14 +6283,14 @@
             <w:tr>
               <w:tc>
                 <w:tcPr>
-                  <w:tcW w:type="dxa" w:w="2000"/>
-                  <w:tcBorders>
-                    <w:top w:val="single" w:color="A6A6A6" w:sz="4"/>
-                    <w:left w:val="single" w:color="A6A6A6" w:sz="4"/>
-                    <w:bottom w:val="single" w:color="A6A6A6" w:sz="4"/>
-                    <w:right w:val="single" w:color="A6A6A6" w:sz="4"/>
-                  </w:tcBorders>
-                  <w:shd w:fill="DCE6F1" w:color="auto" w:val="clear"/>
+                  <w:tcW w:type="dxa" w:w="2400"/>
+                  <w:tcBorders>
+                    <w:top w:val="single" w:color="A6A6A6" w:sz="4"/>
+                    <w:left w:val="single" w:color="A6A6A6" w:sz="4"/>
+                    <w:bottom w:val="single" w:color="A6A6A6" w:sz="4"/>
+                    <w:right w:val="single" w:color="A6A6A6" w:sz="4"/>
+                  </w:tcBorders>
+                  <w:shd w:fill="FFFFFF" w:color="auto" w:val="clear"/>
                   <w:tcMar>
                     <w:top w:type="dxa" w:w="50"/>
                     <w:left w:type="dxa" w:w="80"/>
@@ -6277,20 +6312,20 @@
                       <w:sz w:val="16"/>
                       <w:szCs w:val="16"/>
                     </w:rPr>
-                    <w:t xml:space="preserve">토양침식성인자(K)</w:t>
-                  </w:r>
-                </w:p>
-              </w:tc>
-              <w:tc>
-                <w:tcPr>
-                  <w:tcW w:type="dxa" w:w="1700"/>
-                  <w:tcBorders>
-                    <w:top w:val="single" w:color="A6A6A6" w:sz="4"/>
-                    <w:left w:val="single" w:color="A6A6A6" w:sz="4"/>
-                    <w:bottom w:val="single" w:color="A6A6A6" w:sz="4"/>
-                    <w:right w:val="single" w:color="A6A6A6" w:sz="4"/>
-                  </w:tcBorders>
-                  <w:shd w:fill="DCE6F1" w:color="auto" w:val="clear"/>
+                    <w:t xml:space="preserve">이상치 보정</w:t>
+                  </w:r>
+                </w:p>
+              </w:tc>
+              <w:tc>
+                <w:tcPr>
+                  <w:tcW w:type="dxa" w:w="5700"/>
+                  <w:tcBorders>
+                    <w:top w:val="single" w:color="A6A6A6" w:sz="4"/>
+                    <w:left w:val="single" w:color="A6A6A6" w:sz="4"/>
+                    <w:bottom w:val="single" w:color="A6A6A6" w:sz="4"/>
+                    <w:right w:val="single" w:color="A6A6A6" w:sz="4"/>
+                  </w:tcBorders>
+                  <w:shd w:fill="FFFFFF" w:color="auto" w:val="clear"/>
                   <w:tcMar>
                     <w:top w:type="dxa" w:w="50"/>
                     <w:left w:type="dxa" w:w="80"/>
@@ -6312,13 +6347,15 @@
                       <w:sz w:val="16"/>
                       <w:szCs w:val="16"/>
                     </w:rPr>
-                    <w:t xml:space="preserve">(이름)</w:t>
-                  </w:r>
-                </w:p>
-              </w:tc>
-              <w:tc>
-                <w:tcPr>
-                  <w:tcW w:type="dxa" w:w="4400"/>
+                    <w:t xml:space="preserve">고시 K·SoilGrids 필지 이상값 점검, 보정 전후 기록</w:t>
+                  </w:r>
+                </w:p>
+              </w:tc>
+            </w:tr>
+            <w:tr>
+              <w:tc>
+                <w:tcPr>
+                  <w:tcW w:type="dxa" w:w="2400"/>
                   <w:tcBorders>
                     <w:top w:val="single" w:color="A6A6A6" w:sz="4"/>
                     <w:left w:val="single" w:color="A6A6A6" w:sz="4"/>
@@ -6347,7 +6384,42 @@
                       <w:sz w:val="16"/>
                       <w:szCs w:val="16"/>
                     </w:rPr>
-                    <w:t xml:space="preserve">K 결측치·이상치 보정, K 최종값 확정, 민감도 분석</w:t>
+                    <w:t xml:space="preserve">K 최종값 확정·제공</w:t>
+                  </w:r>
+                </w:p>
+              </w:tc>
+              <w:tc>
+                <w:tcPr>
+                  <w:tcW w:type="dxa" w:w="5700"/>
+                  <w:tcBorders>
+                    <w:top w:val="single" w:color="A6A6A6" w:sz="4"/>
+                    <w:left w:val="single" w:color="A6A6A6" w:sz="4"/>
+                    <w:bottom w:val="single" w:color="A6A6A6" w:sz="4"/>
+                    <w:right w:val="single" w:color="A6A6A6" w:sz="4"/>
+                  </w:tcBorders>
+                  <w:shd w:fill="DCE6F1" w:color="auto" w:val="clear"/>
+                  <w:tcMar>
+                    <w:top w:type="dxa" w:w="50"/>
+                    <w:left w:type="dxa" w:w="80"/>
+                    <w:bottom w:type="dxa" w:w="50"/>
+                    <w:right w:type="dxa" w:w="80"/>
+                  </w:tcMar>
+                  <w:vAlign w:val="center"/>
+                </w:tcPr>
+                <w:p>
+                  <w:pPr>
+                    <w:spacing w:after="0" w:before="0"/>
+                    <w:jc w:val="left"/>
+                  </w:pPr>
+                  <w:r>
+                    <w:rPr>
+                      <w:rFonts w:ascii="맑은 고딕" w:cs="맑은 고딕" w:eastAsia="맑은 고딕" w:hAnsi="맑은 고딕"/>
+                      <w:b w:val="false"/>
+                      <w:bCs w:val="false"/>
+                      <w:sz w:val="16"/>
+                      <w:szCs w:val="16"/>
+                    </w:rPr>
+                    <w:t xml:space="preserve">보정된 지역별·필지별 K를 팀 RUSLE 계산용 격자(EPSG:5179, DEM 90m)로 제공</w:t>
                   </w:r>
                 </w:p>
               </w:tc>
@@ -6355,7 +6427,7 @@
             <w:tr>
               <w:tc>
                 <w:tcPr>
-                  <w:tcW w:type="dxa" w:w="2000"/>
+                  <w:tcW w:type="dxa" w:w="2400"/>
                   <w:tcBorders>
                     <w:top w:val="single" w:color="A6A6A6" w:sz="4"/>
                     <w:left w:val="single" w:color="A6A6A6" w:sz="4"/>
@@ -6384,13 +6456,13 @@
                       <w:sz w:val="16"/>
                       <w:szCs w:val="16"/>
                     </w:rPr>
-                    <w:t xml:space="preserve">식생피복인자(C)</w:t>
-                  </w:r>
-                </w:p>
-              </w:tc>
-              <w:tc>
-                <w:tcPr>
-                  <w:tcW w:type="dxa" w:w="1700"/>
+                    <w:t xml:space="preserve">최종 발표 준비</w:t>
+                  </w:r>
+                </w:p>
+              </w:tc>
+              <w:tc>
+                <w:tcPr>
+                  <w:tcW w:type="dxa" w:w="5700"/>
                   <w:tcBorders>
                     <w:top w:val="single" w:color="A6A6A6" w:sz="4"/>
                     <w:left w:val="single" w:color="A6A6A6" w:sz="4"/>
@@ -6419,363 +6491,7 @@
                       <w:sz w:val="16"/>
                       <w:szCs w:val="16"/>
                     </w:rPr>
-                    <w:t xml:space="preserve">(이름)</w:t>
-                  </w:r>
-                </w:p>
-              </w:tc>
-              <w:tc>
-                <w:tcPr>
-                  <w:tcW w:type="dxa" w:w="4400"/>
-                  <w:tcBorders>
-                    <w:top w:val="single" w:color="A6A6A6" w:sz="4"/>
-                    <w:left w:val="single" w:color="A6A6A6" w:sz="4"/>
-                    <w:bottom w:val="single" w:color="A6A6A6" w:sz="4"/>
-                    <w:right w:val="single" w:color="A6A6A6" w:sz="4"/>
-                  </w:tcBorders>
-                  <w:shd w:fill="FFFFFF" w:color="auto" w:val="clear"/>
-                  <w:tcMar>
-                    <w:top w:type="dxa" w:w="50"/>
-                    <w:left w:type="dxa" w:w="80"/>
-                    <w:bottom w:type="dxa" w:w="50"/>
-                    <w:right w:type="dxa" w:w="80"/>
-                  </w:tcMar>
-                  <w:vAlign w:val="center"/>
-                </w:tcPr>
-                <w:p>
-                  <w:pPr>
-                    <w:spacing w:after="0" w:before="0"/>
-                    <w:jc w:val="left"/>
-                  </w:pPr>
-                  <w:r>
-                    <w:rPr>
-                      <w:rFonts w:ascii="맑은 고딕" w:cs="맑은 고딕" w:eastAsia="맑은 고딕" w:hAnsi="맑은 고딕"/>
-                      <w:b w:val="false"/>
-                      <w:bCs w:val="false"/>
-                      <w:sz w:val="16"/>
-                      <w:szCs w:val="16"/>
-                    </w:rPr>
-                    <w:t xml:space="preserve">토지피복지도 기반 C 산정, 작기별 C 정리</w:t>
-                  </w:r>
-                </w:p>
-              </w:tc>
-            </w:tr>
-            <w:tr>
-              <w:tc>
-                <w:tcPr>
-                  <w:tcW w:type="dxa" w:w="2000"/>
-                  <w:tcBorders>
-                    <w:top w:val="single" w:color="A6A6A6" w:sz="4"/>
-                    <w:left w:val="single" w:color="A6A6A6" w:sz="4"/>
-                    <w:bottom w:val="single" w:color="A6A6A6" w:sz="4"/>
-                    <w:right w:val="single" w:color="A6A6A6" w:sz="4"/>
-                  </w:tcBorders>
-                  <w:shd w:fill="DCE6F1" w:color="auto" w:val="clear"/>
-                  <w:tcMar>
-                    <w:top w:type="dxa" w:w="50"/>
-                    <w:left w:type="dxa" w:w="80"/>
-                    <w:bottom w:type="dxa" w:w="50"/>
-                    <w:right w:type="dxa" w:w="80"/>
-                  </w:tcMar>
-                  <w:vAlign w:val="center"/>
-                </w:tcPr>
-                <w:p>
-                  <w:pPr>
-                    <w:spacing w:after="0" w:before="0"/>
-                    <w:jc w:val="left"/>
-                  </w:pPr>
-                  <w:r>
-                    <w:rPr>
-                      <w:rFonts w:ascii="맑은 고딕" w:cs="맑은 고딕" w:eastAsia="맑은 고딕" w:hAnsi="맑은 고딕"/>
-                      <w:b w:val="false"/>
-                      <w:bCs w:val="false"/>
-                      <w:sz w:val="16"/>
-                      <w:szCs w:val="16"/>
-                    </w:rPr>
-                    <w:t xml:space="preserve">강우인자(R)</w:t>
-                  </w:r>
-                </w:p>
-              </w:tc>
-              <w:tc>
-                <w:tcPr>
-                  <w:tcW w:type="dxa" w:w="1700"/>
-                  <w:tcBorders>
-                    <w:top w:val="single" w:color="A6A6A6" w:sz="4"/>
-                    <w:left w:val="single" w:color="A6A6A6" w:sz="4"/>
-                    <w:bottom w:val="single" w:color="A6A6A6" w:sz="4"/>
-                    <w:right w:val="single" w:color="A6A6A6" w:sz="4"/>
-                  </w:tcBorders>
-                  <w:shd w:fill="DCE6F1" w:color="auto" w:val="clear"/>
-                  <w:tcMar>
-                    <w:top w:type="dxa" w:w="50"/>
-                    <w:left w:type="dxa" w:w="80"/>
-                    <w:bottom w:type="dxa" w:w="50"/>
-                    <w:right w:type="dxa" w:w="80"/>
-                  </w:tcMar>
-                  <w:vAlign w:val="center"/>
-                </w:tcPr>
-                <w:p>
-                  <w:pPr>
-                    <w:spacing w:after="0" w:before="0"/>
-                    <w:jc w:val="left"/>
-                  </w:pPr>
-                  <w:r>
-                    <w:rPr>
-                      <w:rFonts w:ascii="맑은 고딕" w:cs="맑은 고딕" w:eastAsia="맑은 고딕" w:hAnsi="맑은 고딕"/>
-                      <w:b w:val="false"/>
-                      <w:bCs w:val="false"/>
-                      <w:sz w:val="16"/>
-                      <w:szCs w:val="16"/>
-                    </w:rPr>
-                    <w:t xml:space="preserve">(이름)</w:t>
-                  </w:r>
-                </w:p>
-              </w:tc>
-              <w:tc>
-                <w:tcPr>
-                  <w:tcW w:type="dxa" w:w="4400"/>
-                  <w:tcBorders>
-                    <w:top w:val="single" w:color="A6A6A6" w:sz="4"/>
-                    <w:left w:val="single" w:color="A6A6A6" w:sz="4"/>
-                    <w:bottom w:val="single" w:color="A6A6A6" w:sz="4"/>
-                    <w:right w:val="single" w:color="A6A6A6" w:sz="4"/>
-                  </w:tcBorders>
-                  <w:shd w:fill="DCE6F1" w:color="auto" w:val="clear"/>
-                  <w:tcMar>
-                    <w:top w:type="dxa" w:w="50"/>
-                    <w:left w:type="dxa" w:w="80"/>
-                    <w:bottom w:type="dxa" w:w="50"/>
-                    <w:right w:type="dxa" w:w="80"/>
-                  </w:tcMar>
-                  <w:vAlign w:val="center"/>
-                </w:tcPr>
-                <w:p>
-                  <w:pPr>
-                    <w:spacing w:after="0" w:before="0"/>
-                    <w:jc w:val="left"/>
-                  </w:pPr>
-                  <w:r>
-                    <w:rPr>
-                      <w:rFonts w:ascii="맑은 고딕" w:cs="맑은 고딕" w:eastAsia="맑은 고딕" w:hAnsi="맑은 고딕"/>
-                      <w:b w:val="false"/>
-                      <w:bCs w:val="false"/>
-                      <w:sz w:val="16"/>
-                      <w:szCs w:val="16"/>
-                    </w:rPr>
-                    <w:t xml:space="preserve">강우자료 수집, 호우 기준 R 산정</w:t>
-                  </w:r>
-                </w:p>
-              </w:tc>
-            </w:tr>
-            <w:tr>
-              <w:tc>
-                <w:tcPr>
-                  <w:tcW w:type="dxa" w:w="2000"/>
-                  <w:tcBorders>
-                    <w:top w:val="single" w:color="A6A6A6" w:sz="4"/>
-                    <w:left w:val="single" w:color="A6A6A6" w:sz="4"/>
-                    <w:bottom w:val="single" w:color="A6A6A6" w:sz="4"/>
-                    <w:right w:val="single" w:color="A6A6A6" w:sz="4"/>
-                  </w:tcBorders>
-                  <w:shd w:fill="FFFFFF" w:color="auto" w:val="clear"/>
-                  <w:tcMar>
-                    <w:top w:type="dxa" w:w="50"/>
-                    <w:left w:type="dxa" w:w="80"/>
-                    <w:bottom w:type="dxa" w:w="50"/>
-                    <w:right w:type="dxa" w:w="80"/>
-                  </w:tcMar>
-                  <w:vAlign w:val="center"/>
-                </w:tcPr>
-                <w:p>
-                  <w:pPr>
-                    <w:spacing w:after="0" w:before="0"/>
-                    <w:jc w:val="left"/>
-                  </w:pPr>
-                  <w:r>
-                    <w:rPr>
-                      <w:rFonts w:ascii="맑은 고딕" w:cs="맑은 고딕" w:eastAsia="맑은 고딕" w:hAnsi="맑은 고딕"/>
-                      <w:b w:val="false"/>
-                      <w:bCs w:val="false"/>
-                      <w:sz w:val="16"/>
-                      <w:szCs w:val="16"/>
-                    </w:rPr>
-                    <w:t xml:space="preserve">지형인자(LS)·보전관리(P)</w:t>
-                  </w:r>
-                </w:p>
-              </w:tc>
-              <w:tc>
-                <w:tcPr>
-                  <w:tcW w:type="dxa" w:w="1700"/>
-                  <w:tcBorders>
-                    <w:top w:val="single" w:color="A6A6A6" w:sz="4"/>
-                    <w:left w:val="single" w:color="A6A6A6" w:sz="4"/>
-                    <w:bottom w:val="single" w:color="A6A6A6" w:sz="4"/>
-                    <w:right w:val="single" w:color="A6A6A6" w:sz="4"/>
-                  </w:tcBorders>
-                  <w:shd w:fill="FFFFFF" w:color="auto" w:val="clear"/>
-                  <w:tcMar>
-                    <w:top w:type="dxa" w:w="50"/>
-                    <w:left w:type="dxa" w:w="80"/>
-                    <w:bottom w:type="dxa" w:w="50"/>
-                    <w:right w:type="dxa" w:w="80"/>
-                  </w:tcMar>
-                  <w:vAlign w:val="center"/>
-                </w:tcPr>
-                <w:p>
-                  <w:pPr>
-                    <w:spacing w:after="0" w:before="0"/>
-                    <w:jc w:val="left"/>
-                  </w:pPr>
-                  <w:r>
-                    <w:rPr>
-                      <w:rFonts w:ascii="맑은 고딕" w:cs="맑은 고딕" w:eastAsia="맑은 고딕" w:hAnsi="맑은 고딕"/>
-                      <w:b w:val="false"/>
-                      <w:bCs w:val="false"/>
-                      <w:sz w:val="16"/>
-                      <w:szCs w:val="16"/>
-                    </w:rPr>
-                    <w:t xml:space="preserve">(이름)</w:t>
-                  </w:r>
-                </w:p>
-              </w:tc>
-              <w:tc>
-                <w:tcPr>
-                  <w:tcW w:type="dxa" w:w="4400"/>
-                  <w:tcBorders>
-                    <w:top w:val="single" w:color="A6A6A6" w:sz="4"/>
-                    <w:left w:val="single" w:color="A6A6A6" w:sz="4"/>
-                    <w:bottom w:val="single" w:color="A6A6A6" w:sz="4"/>
-                    <w:right w:val="single" w:color="A6A6A6" w:sz="4"/>
-                  </w:tcBorders>
-                  <w:shd w:fill="FFFFFF" w:color="auto" w:val="clear"/>
-                  <w:tcMar>
-                    <w:top w:type="dxa" w:w="50"/>
-                    <w:left w:type="dxa" w:w="80"/>
-                    <w:bottom w:type="dxa" w:w="50"/>
-                    <w:right w:type="dxa" w:w="80"/>
-                  </w:tcMar>
-                  <w:vAlign w:val="center"/>
-                </w:tcPr>
-                <w:p>
-                  <w:pPr>
-                    <w:spacing w:after="0" w:before="0"/>
-                    <w:jc w:val="left"/>
-                  </w:pPr>
-                  <w:r>
-                    <w:rPr>
-                      <w:rFonts w:ascii="맑은 고딕" w:cs="맑은 고딕" w:eastAsia="맑은 고딕" w:hAnsi="맑은 고딕"/>
-                      <w:b w:val="false"/>
-                      <w:bCs w:val="false"/>
-                      <w:sz w:val="16"/>
-                      <w:szCs w:val="16"/>
-                    </w:rPr>
-                    <w:t xml:space="preserve">DEM 기반 LS 산정, P 적용 기준 정리</w:t>
-                  </w:r>
-                </w:p>
-              </w:tc>
-            </w:tr>
-            <w:tr>
-              <w:tc>
-                <w:tcPr>
-                  <w:tcW w:type="dxa" w:w="2000"/>
-                  <w:tcBorders>
-                    <w:top w:val="single" w:color="A6A6A6" w:sz="4"/>
-                    <w:left w:val="single" w:color="A6A6A6" w:sz="4"/>
-                    <w:bottom w:val="single" w:color="A6A6A6" w:sz="4"/>
-                    <w:right w:val="single" w:color="A6A6A6" w:sz="4"/>
-                  </w:tcBorders>
-                  <w:shd w:fill="DCE6F1" w:color="auto" w:val="clear"/>
-                  <w:tcMar>
-                    <w:top w:type="dxa" w:w="50"/>
-                    <w:left w:type="dxa" w:w="80"/>
-                    <w:bottom w:type="dxa" w:w="50"/>
-                    <w:right w:type="dxa" w:w="80"/>
-                  </w:tcMar>
-                  <w:vAlign w:val="center"/>
-                </w:tcPr>
-                <w:p>
-                  <w:pPr>
-                    <w:spacing w:after="0" w:before="0"/>
-                    <w:jc w:val="left"/>
-                  </w:pPr>
-                  <w:r>
-                    <w:rPr>
-                      <w:rFonts w:ascii="맑은 고딕" w:cs="맑은 고딕" w:eastAsia="맑은 고딕" w:hAnsi="맑은 고딕"/>
-                      <w:b w:val="false"/>
-                      <w:bCs w:val="false"/>
-                      <w:sz w:val="16"/>
-                      <w:szCs w:val="16"/>
-                    </w:rPr>
-                    <w:t xml:space="preserve">통합·발표</w:t>
-                  </w:r>
-                </w:p>
-              </w:tc>
-              <w:tc>
-                <w:tcPr>
-                  <w:tcW w:type="dxa" w:w="1700"/>
-                  <w:tcBorders>
-                    <w:top w:val="single" w:color="A6A6A6" w:sz="4"/>
-                    <w:left w:val="single" w:color="A6A6A6" w:sz="4"/>
-                    <w:bottom w:val="single" w:color="A6A6A6" w:sz="4"/>
-                    <w:right w:val="single" w:color="A6A6A6" w:sz="4"/>
-                  </w:tcBorders>
-                  <w:shd w:fill="DCE6F1" w:color="auto" w:val="clear"/>
-                  <w:tcMar>
-                    <w:top w:type="dxa" w:w="50"/>
-                    <w:left w:type="dxa" w:w="80"/>
-                    <w:bottom w:type="dxa" w:w="50"/>
-                    <w:right w:type="dxa" w:w="80"/>
-                  </w:tcMar>
-                  <w:vAlign w:val="center"/>
-                </w:tcPr>
-                <w:p>
-                  <w:pPr>
-                    <w:spacing w:after="0" w:before="0"/>
-                    <w:jc w:val="left"/>
-                  </w:pPr>
-                  <w:r>
-                    <w:rPr>
-                      <w:rFonts w:ascii="맑은 고딕" w:cs="맑은 고딕" w:eastAsia="맑은 고딕" w:hAnsi="맑은 고딕"/>
-                      <w:b w:val="false"/>
-                      <w:bCs w:val="false"/>
-                      <w:sz w:val="16"/>
-                      <w:szCs w:val="16"/>
-                    </w:rPr>
-                    <w:t xml:space="preserve">팀 전체</w:t>
-                  </w:r>
-                </w:p>
-              </w:tc>
-              <w:tc>
-                <w:tcPr>
-                  <w:tcW w:type="dxa" w:w="4400"/>
-                  <w:tcBorders>
-                    <w:top w:val="single" w:color="A6A6A6" w:sz="4"/>
-                    <w:left w:val="single" w:color="A6A6A6" w:sz="4"/>
-                    <w:bottom w:val="single" w:color="A6A6A6" w:sz="4"/>
-                    <w:right w:val="single" w:color="A6A6A6" w:sz="4"/>
-                  </w:tcBorders>
-                  <w:shd w:fill="DCE6F1" w:color="auto" w:val="clear"/>
-                  <w:tcMar>
-                    <w:top w:type="dxa" w:w="50"/>
-                    <w:left w:type="dxa" w:w="80"/>
-                    <w:bottom w:type="dxa" w:w="50"/>
-                    <w:right w:type="dxa" w:w="80"/>
-                  </w:tcMar>
-                  <w:vAlign w:val="center"/>
-                </w:tcPr>
-                <w:p>
-                  <w:pPr>
-                    <w:spacing w:after="0" w:before="0"/>
-                    <w:jc w:val="left"/>
-                  </w:pPr>
-                  <w:r>
-                    <w:rPr>
-                      <w:rFonts w:ascii="맑은 고딕" w:cs="맑은 고딕" w:eastAsia="맑은 고딕" w:hAnsi="맑은 고딕"/>
-                      <w:b w:val="false"/>
-                      <w:bCs w:val="false"/>
-                      <w:sz w:val="16"/>
-                      <w:szCs w:val="16"/>
-                    </w:rPr>
-                    <w:t xml:space="preserve">RUSLE 통합 계산, 최종 보고서·발표 자료</w:t>
+                    <w:t xml:space="preserve">K 결과 지도·표, AI 활용 기록표 정리</w:t>
                   </w:r>
                 </w:p>
               </w:tc>

</xml_diff>